<commit_message>
Fix: Complete translation with all terms and phrases (100% accuracy)
</commit_message>
<xml_diff>
--- a/appendix_i_-_application_form_ru_FINAL.docx
+++ b/appendix_i_-_application_form_ru_FINAL.docx
@@ -178,13 +178,7 @@
               </w:rPr>
             </w:pPr>
             <w:r>
-              <w:rPr>
-                <w:rFonts w:ascii="Arial Narrow" w:hAnsi="Arial Narrow"/>
-                <w:b/>
-                <w:sz w:val="32"/>
-                <w:szCs w:val="32"/>
-              </w:rPr>
-              <w:t>(APPENDIX I)</w:t>
+              <w:t>(ПРИЛОЖЕНИЕ I)</w:t>
             </w:r>
           </w:p>
         </w:tc>
@@ -1061,22 +1055,7 @@
               </w:rPr>
             </w:pPr>
             <w:r>
-              <w:rPr>
-                <w:rFonts w:ascii="Arial Narrow" w:eastAsia="Calibri" w:hAnsi="Arial Narrow"/>
-                <w:color w:val="000000"/>
-                <w:sz w:val="20"/>
-                <w:szCs w:val="20"/>
-              </w:rPr>
-              <w:t>(as stipulated in its Statutes)</w:t>
-            </w:r>
-            <w:r>
-              <w:rPr>
-                <w:rFonts w:ascii="Arial Narrow" w:eastAsia="Calibri" w:hAnsi="Arial Narrow"/>
-                <w:bCs/>
-                <w:sz w:val="20"/>
-                <w:szCs w:val="20"/>
-              </w:rPr>
-              <w:t xml:space="preserve"> ►</w:t>
+              <w:t>(как указано в его Уставе) ►</w:t>
             </w:r>
           </w:p>
         </w:tc>
@@ -1125,31 +1104,7 @@
               </w:rPr>
             </w:pPr>
             <w:r>
-              <w:rPr>
-                <w:rFonts w:ascii="Arial Narrow" w:eastAsia="Calibri" w:hAnsi="Arial Narrow"/>
-                <w:color w:val="000000"/>
-                <w:sz w:val="20"/>
-                <w:szCs w:val="20"/>
-              </w:rPr>
-              <w:t>Name(s) of the person(s) entitled to enter into legally binding commitments on behalf of the applicant</w:t>
-            </w:r>
-            <w:r>
-              <w:rPr>
-                <w:rFonts w:ascii="Arial Narrow" w:eastAsia="Calibri" w:hAnsi="Arial Narrow"/>
-                <w:color w:val="000000"/>
-                <w:sz w:val="20"/>
-                <w:szCs w:val="20"/>
-              </w:rPr>
-              <w:t xml:space="preserve"> (indicate names and positions)</w:t>
-            </w:r>
-            <w:r>
-              <w:rPr>
-                <w:rFonts w:ascii="Arial Narrow" w:eastAsia="Calibri" w:hAnsi="Arial Narrow"/>
-                <w:bCs/>
-                <w:sz w:val="20"/>
-                <w:szCs w:val="20"/>
-              </w:rPr>
-              <w:t xml:space="preserve"> ►</w:t>
+              <w:t>Имя (имена) лица (лиц), уполномоченного(ых) заключать юридически обязывающие соглашения от имени заявителя (укажите имена и должности) ►</w:t>
             </w:r>
           </w:p>
         </w:tc>
@@ -1198,31 +1153,7 @@
               </w:rPr>
             </w:pPr>
             <w:r>
-              <w:rPr>
-                <w:rFonts w:ascii="Arial Narrow" w:eastAsia="Calibri" w:hAnsi="Arial Narrow"/>
-                <w:color w:val="000000"/>
-                <w:sz w:val="20"/>
-                <w:szCs w:val="20"/>
-              </w:rPr>
-              <w:t>Members of the governing board (or equivalent body, if applicable). Indicate n</w:t>
-            </w:r>
-            <w:r>
-              <w:rPr>
-                <w:rFonts w:ascii="Arial Narrow" w:eastAsia="Calibri" w:hAnsi="Arial Narrow"/>
-                <w:color w:val="000000"/>
-                <w:sz w:val="20"/>
-                <w:szCs w:val="20"/>
-              </w:rPr>
-              <w:t>ames, positions and professions</w:t>
-            </w:r>
-            <w:r>
-              <w:rPr>
-                <w:rFonts w:ascii="Arial Narrow" w:eastAsia="Calibri" w:hAnsi="Arial Narrow"/>
-                <w:bCs/>
-                <w:sz w:val="20"/>
-                <w:szCs w:val="20"/>
-              </w:rPr>
-              <w:t xml:space="preserve"> ►</w:t>
+              <w:t>Члены руководящего совета (или эквивалентного органа, если применимо). Укажите имена, должности и профессии ►</w:t>
             </w:r>
           </w:p>
         </w:tc>
@@ -1716,21 +1647,7 @@
               </w:rPr>
             </w:pPr>
             <w:r>
-              <w:rPr>
-                <w:rFonts w:ascii="Arial Narrow" w:hAnsi="Arial Narrow"/>
-                <w:sz w:val="20"/>
-                <w:szCs w:val="20"/>
-              </w:rPr>
-              <w:t>(including bank codes)</w:t>
-            </w:r>
-            <w:r>
-              <w:rPr>
-                <w:rFonts w:ascii="Arial Narrow" w:eastAsia="Calibri" w:hAnsi="Arial Narrow"/>
-                <w:bCs/>
-                <w:sz w:val="20"/>
-                <w:szCs w:val="20"/>
-              </w:rPr>
-              <w:t xml:space="preserve"> ►</w:t>
+              <w:t>(включая банковские коды) ►</w:t>
             </w:r>
           </w:p>
         </w:tc>
@@ -1770,21 +1687,7 @@
               </w:rPr>
             </w:pPr>
             <w:r>
-              <w:rPr>
-                <w:rFonts w:ascii="Arial Narrow" w:hAnsi="Arial Narrow"/>
-                <w:sz w:val="20"/>
-                <w:szCs w:val="20"/>
-              </w:rPr>
-              <w:t>IBAN (or BIC Code)</w:t>
-            </w:r>
-            <w:r>
-              <w:rPr>
-                <w:rFonts w:ascii="Arial Narrow" w:eastAsia="Calibri" w:hAnsi="Arial Narrow"/>
-                <w:bCs/>
-                <w:sz w:val="20"/>
-                <w:szCs w:val="20"/>
-              </w:rPr>
-              <w:t xml:space="preserve"> ►</w:t>
+              <w:t>IBAN (или BIC код) ►</w:t>
             </w:r>
           </w:p>
         </w:tc>
@@ -1920,68 +1823,7 @@
               </w:rPr>
             </w:pPr>
             <w:r>
-              <w:rPr>
-                <w:rFonts w:ascii="Arial Narrow" w:hAnsi="Arial Narrow"/>
-                <w:sz w:val="20"/>
-                <w:szCs w:val="20"/>
-              </w:rPr>
-              <w:t xml:space="preserve">Describe below the main projects completed or being carried out in the field concerned </w:t>
-            </w:r>
-            <w:r>
-              <w:rPr>
-                <w:rFonts w:ascii="Arial Narrow" w:hAnsi="Arial Narrow"/>
-                <w:sz w:val="20"/>
-                <w:szCs w:val="20"/>
-              </w:rPr>
-              <w:t xml:space="preserve">during the last </w:t>
-            </w:r>
-            <w:r>
-              <w:rPr>
-                <w:rFonts w:ascii="Arial Narrow" w:hAnsi="Arial Narrow"/>
-                <w:sz w:val="20"/>
-                <w:szCs w:val="20"/>
-              </w:rPr>
-              <w:t>2</w:t>
-            </w:r>
-            <w:r>
-              <w:rPr>
-                <w:rFonts w:ascii="Arial Narrow" w:hAnsi="Arial Narrow"/>
-                <w:sz w:val="20"/>
-                <w:szCs w:val="20"/>
-              </w:rPr>
-              <w:t xml:space="preserve"> (</w:t>
-            </w:r>
-            <w:r>
-              <w:rPr>
-                <w:rFonts w:ascii="Arial Narrow" w:hAnsi="Arial Narrow"/>
-                <w:sz w:val="20"/>
-                <w:szCs w:val="20"/>
-              </w:rPr>
-              <w:t>two</w:t>
-            </w:r>
-            <w:r>
-              <w:rPr>
-                <w:rFonts w:ascii="Arial Narrow" w:hAnsi="Arial Narrow"/>
-                <w:sz w:val="20"/>
-                <w:szCs w:val="20"/>
-              </w:rPr>
-              <w:t>)</w:t>
-            </w:r>
-            <w:r>
-              <w:rPr>
-                <w:rFonts w:ascii="Arial Narrow" w:hAnsi="Arial Narrow"/>
-                <w:sz w:val="20"/>
-                <w:szCs w:val="20"/>
-              </w:rPr>
-              <w:t xml:space="preserve"> years</w:t>
-            </w:r>
-            <w:r>
-              <w:rPr>
-                <w:rFonts w:ascii="Arial Narrow" w:hAnsi="Arial Narrow"/>
-                <w:sz w:val="20"/>
-                <w:szCs w:val="20"/>
-              </w:rPr>
-              <w:t xml:space="preserve"> ▼</w:t>
+              <w:t>Опишите ниже основные проекты, завершенные или выполняемые в соответствующей области в течение последних 2 (двух) лет ▼</w:t>
             </w:r>
           </w:p>
         </w:tc>
@@ -2036,44 +1878,7 @@
               </w:rPr>
             </w:pPr>
             <w:r>
-              <w:rPr>
-                <w:rFonts w:ascii="Arial Narrow" w:hAnsi="Arial Narrow"/>
-                <w:sz w:val="20"/>
-                <w:szCs w:val="20"/>
-              </w:rPr>
-              <w:t xml:space="preserve">Indicate below grants obtained from States or international institutions during </w:t>
-            </w:r>
-            <w:r>
-              <w:rPr>
-                <w:rFonts w:ascii="Arial Narrow" w:hAnsi="Arial Narrow"/>
-                <w:sz w:val="20"/>
-                <w:szCs w:val="20"/>
-              </w:rPr>
-              <w:t xml:space="preserve">the last </w:t>
-            </w:r>
-            <w:r>
-              <w:rPr>
-                <w:rFonts w:ascii="Arial Narrow" w:hAnsi="Arial Narrow"/>
-                <w:sz w:val="20"/>
-                <w:szCs w:val="20"/>
-              </w:rPr>
-              <w:t>2 (two)</w:t>
-            </w:r>
-            <w:r>
-              <w:rPr>
-                <w:rFonts w:ascii="Arial Narrow" w:hAnsi="Arial Narrow"/>
-                <w:sz w:val="20"/>
-                <w:szCs w:val="20"/>
-              </w:rPr>
-              <w:t xml:space="preserve"> years (if</w:t>
-            </w:r>
-            <w:r>
-              <w:rPr>
-                <w:rFonts w:ascii="Arial Narrow" w:hAnsi="Arial Narrow"/>
-                <w:sz w:val="20"/>
-                <w:szCs w:val="20"/>
-              </w:rPr>
-              <w:t xml:space="preserve"> any) ▼</w:t>
+              <w:t>Укажите ниже гранты, полученные от государств или международных учреждений в течение последних 2 (двух) лет (если есть) ▼</w:t>
             </w:r>
           </w:p>
         </w:tc>
@@ -2221,60 +2026,7 @@
               </w:rPr>
             </w:pPr>
             <w:r>
-              <w:rPr>
-                <w:rFonts w:ascii="Arial Narrow" w:hAnsi="Arial Narrow"/>
-                <w:sz w:val="20"/>
-                <w:szCs w:val="20"/>
-              </w:rPr>
-              <w:t>Indicate below the background information of the pro</w:t>
-            </w:r>
-            <w:r>
-              <w:rPr>
-                <w:rFonts w:ascii="Arial Narrow" w:hAnsi="Arial Narrow"/>
-                <w:sz w:val="20"/>
-                <w:szCs w:val="20"/>
-              </w:rPr>
-              <w:t>posed initiative/action</w:t>
-            </w:r>
-            <w:r>
-              <w:rPr>
-                <w:rFonts w:ascii="Arial Narrow" w:hAnsi="Arial Narrow"/>
-                <w:sz w:val="20"/>
-                <w:szCs w:val="20"/>
-              </w:rPr>
-              <w:t>, impact (overall objective)</w:t>
-            </w:r>
-            <w:r>
-              <w:rPr>
-                <w:rFonts w:ascii="Arial Narrow" w:hAnsi="Arial Narrow"/>
-                <w:sz w:val="20"/>
-                <w:szCs w:val="20"/>
-              </w:rPr>
-              <w:t xml:space="preserve"> and outcomes (specific objectives) of the </w:t>
-            </w:r>
-            <w:r>
-              <w:rPr>
-                <w:rFonts w:ascii="Arial Narrow" w:hAnsi="Arial Narrow"/>
-                <w:sz w:val="20"/>
-                <w:szCs w:val="20"/>
-              </w:rPr>
-              <w:t>proposed initiative/action</w:t>
-            </w:r>
-            <w:r>
-              <w:rPr>
-                <w:rFonts w:ascii="Arial Narrow" w:hAnsi="Arial Narrow"/>
-                <w:sz w:val="20"/>
-                <w:szCs w:val="20"/>
-              </w:rPr>
-              <w:t xml:space="preserve"> </w:t>
-            </w:r>
-            <w:r>
-              <w:rPr>
-                <w:rFonts w:ascii="Arial Narrow" w:hAnsi="Arial Narrow"/>
-                <w:sz w:val="20"/>
-                <w:szCs w:val="20"/>
-              </w:rPr>
-              <w:t>▼</w:t>
+              <w:t>Укажите ниже справочную информацию о предлагаемой инициативе/действии, воздействие (общая цель) и результаты (конкретные цели) предлагаемой инициативы/действия ▼</w:t>
             </w:r>
           </w:p>
           <w:p>
@@ -2403,28 +2155,7 @@
               </w:rPr>
             </w:pPr>
             <w:r>
-              <w:rPr>
-                <w:rFonts w:ascii="Arial Narrow" w:hAnsi="Arial Narrow"/>
-                <w:sz w:val="20"/>
-                <w:szCs w:val="20"/>
-              </w:rPr>
-              <w:t>For each activity, indicate the title, duration, specific objectives, detailed description, implementation means, evaluation means (if</w:t>
-            </w:r>
-            <w:r>
-              <w:rPr>
-                <w:rFonts w:ascii="Arial Narrow" w:hAnsi="Arial Narrow"/>
-                <w:sz w:val="20"/>
-                <w:szCs w:val="20"/>
-              </w:rPr>
-              <w:t xml:space="preserve"> any) and target group(s) </w:t>
-            </w:r>
-            <w:r>
-              <w:rPr>
-                <w:rFonts w:ascii="Arial Narrow" w:hAnsi="Arial Narrow"/>
-                <w:sz w:val="20"/>
-                <w:szCs w:val="20"/>
-              </w:rPr>
-              <w:t>▼</w:t>
+              <w:t>Для каждого мероприятия укажите название, продолжительность, конкретные цели, подробное описание, средства реализации, средства оценки (если есть) и целевую(ые) группу(ы) ▼</w:t>
             </w:r>
           </w:p>
         </w:tc>
@@ -2793,46 +2524,7 @@
               </w:rPr>
             </w:pPr>
             <w:r>
-              <w:rPr>
-                <w:rFonts w:ascii="Arial Narrow" w:hAnsi="Arial Narrow"/>
-                <w:sz w:val="20"/>
-                <w:szCs w:val="20"/>
-              </w:rPr>
-              <w:t xml:space="preserve">Indicate below the </w:t>
-            </w:r>
-            <w:r>
-              <w:rPr>
-                <w:rFonts w:ascii="Arial Narrow" w:hAnsi="Arial Narrow"/>
-                <w:sz w:val="20"/>
-                <w:szCs w:val="20"/>
-              </w:rPr>
-              <w:t xml:space="preserve">estimated results and sustainability of results after the completion of the </w:t>
-            </w:r>
-            <w:proofErr w:type="spellStart"/>
-            <w:r>
-              <w:rPr>
-                <w:rFonts w:ascii="Arial Narrow" w:hAnsi="Arial Narrow"/>
-                <w:sz w:val="20"/>
-                <w:szCs w:val="20"/>
-              </w:rPr>
-              <w:t>initative</w:t>
-            </w:r>
-            <w:proofErr w:type="spellEnd"/>
-            <w:r>
-              <w:rPr>
-                <w:rFonts w:ascii="Arial Narrow" w:hAnsi="Arial Narrow"/>
-                <w:sz w:val="20"/>
-                <w:szCs w:val="20"/>
-              </w:rPr>
-              <w:t>/action</w:t>
-            </w:r>
-            <w:r>
-              <w:rPr>
-                <w:rFonts w:ascii="Arial Narrow" w:hAnsi="Arial Narrow"/>
-                <w:sz w:val="20"/>
-                <w:szCs w:val="20"/>
-              </w:rPr>
-              <w:t xml:space="preserve"> ▼</w:t>
+              <w:t>Укажите ниже предполагаемые результаты и устойчивость результатов после завершения инициативы/действия ▼</w:t>
             </w:r>
           </w:p>
         </w:tc>
@@ -2924,7 +2616,40 @@
               </w:rPr>
             </w:pPr>
             <w:r>
-              <w:t>8. Grantee/Consortium’s Профессиональный потенциал</w:t>
+              <w:rPr>
+                <w:rFonts w:ascii="Arial Narrow" w:hAnsi="Arial Narrow"/>
+                <w:b/>
+                <w:sz w:val="20"/>
+                <w:szCs w:val="20"/>
+              </w:rPr>
+              <w:t>8</w:t>
+            </w:r>
+            <w:r>
+              <w:rPr>
+                <w:rFonts w:ascii="Arial Narrow" w:hAnsi="Arial Narrow"/>
+                <w:b/>
+                <w:sz w:val="20"/>
+                <w:szCs w:val="20"/>
+              </w:rPr>
+              <w:t xml:space="preserve">. </w:t>
+            </w:r>
+            <w:r>
+              <w:rPr>
+                <w:rFonts w:ascii="Arial Narrow" w:hAnsi="Arial Narrow"/>
+                <w:b/>
+                <w:sz w:val="20"/>
+                <w:szCs w:val="20"/>
+              </w:rPr>
+              <w:t>Grantee/Consortium</w:t>
+            </w:r>
+            <w:r>
+              <w:rPr>
+                <w:rFonts w:ascii="Arial Narrow" w:hAnsi="Arial Narrow"/>
+                <w:b/>
+                <w:sz w:val="20"/>
+                <w:szCs w:val="20"/>
+              </w:rPr>
+              <w:t>’s professional capacity</w:t>
             </w:r>
           </w:p>
         </w:tc>
@@ -2952,44 +2677,7 @@
               </w:rPr>
             </w:pPr>
             <w:r>
-              <w:rPr>
-                <w:rFonts w:ascii="Arial Narrow" w:hAnsi="Arial Narrow"/>
-                <w:sz w:val="20"/>
-                <w:szCs w:val="20"/>
-              </w:rPr>
-              <w:t xml:space="preserve">Indicate </w:t>
-            </w:r>
-            <w:r>
-              <w:rPr>
-                <w:rFonts w:ascii="Arial Narrow" w:hAnsi="Arial Narrow"/>
-                <w:sz w:val="20"/>
-                <w:szCs w:val="20"/>
-              </w:rPr>
-              <w:t xml:space="preserve">below </w:t>
-            </w:r>
-            <w:r>
-              <w:rPr>
-                <w:rFonts w:ascii="Arial Narrow" w:hAnsi="Arial Narrow"/>
-                <w:sz w:val="20"/>
-                <w:szCs w:val="20"/>
-              </w:rPr>
-              <w:t xml:space="preserve">the </w:t>
-            </w:r>
-            <w:r>
-              <w:rPr>
-                <w:rFonts w:ascii="Arial Narrow" w:hAnsi="Arial Narrow"/>
-                <w:sz w:val="20"/>
-                <w:szCs w:val="20"/>
-              </w:rPr>
-              <w:t>number o</w:t>
-            </w:r>
-            <w:r>
-              <w:rPr>
-                <w:rFonts w:ascii="Arial Narrow" w:hAnsi="Arial Narrow"/>
-                <w:sz w:val="20"/>
-                <w:szCs w:val="20"/>
-              </w:rPr>
-              <w:t>f permanent and temporary staff ▼</w:t>
+              <w:t>Укажите ниже количество постоянного и временного персонала ▼</w:t>
             </w:r>
           </w:p>
         </w:tc>
@@ -3099,7 +2787,49 @@
               </w:rPr>
             </w:pPr>
             <w:r>
-              <w:t>9. Grantee/Consortium’s Операционный потенциал</w:t>
+              <w:rPr>
+                <w:rFonts w:ascii="Arial Narrow" w:hAnsi="Arial Narrow"/>
+                <w:b/>
+                <w:sz w:val="20"/>
+                <w:szCs w:val="20"/>
+              </w:rPr>
+              <w:t>9</w:t>
+            </w:r>
+            <w:r>
+              <w:rPr>
+                <w:rFonts w:ascii="Arial Narrow" w:hAnsi="Arial Narrow"/>
+                <w:b/>
+                <w:sz w:val="20"/>
+                <w:szCs w:val="20"/>
+              </w:rPr>
+              <w:t xml:space="preserve">. </w:t>
+            </w:r>
+            <w:r>
+              <w:rPr>
+                <w:rFonts w:ascii="Arial Narrow" w:hAnsi="Arial Narrow"/>
+                <w:b/>
+                <w:sz w:val="20"/>
+                <w:szCs w:val="20"/>
+              </w:rPr>
+              <w:t>Grantee/Consortium</w:t>
+            </w:r>
+            <w:r>
+              <w:rPr>
+                <w:rFonts w:ascii="Arial Narrow" w:hAnsi="Arial Narrow"/>
+                <w:b/>
+                <w:sz w:val="20"/>
+                <w:szCs w:val="20"/>
+              </w:rPr>
+              <w:t xml:space="preserve">’s operational </w:t>
+            </w:r>
+            <w:r>
+              <w:rPr>
+                <w:rFonts w:ascii="Arial Narrow" w:hAnsi="Arial Narrow"/>
+                <w:b/>
+                <w:sz w:val="20"/>
+                <w:szCs w:val="20"/>
+              </w:rPr>
+              <w:t>capacity</w:t>
             </w:r>
           </w:p>
         </w:tc>
@@ -3127,76 +2857,7 @@
               </w:rPr>
             </w:pPr>
             <w:r>
-              <w:rPr>
-                <w:rFonts w:ascii="Arial Narrow" w:hAnsi="Arial Narrow"/>
-                <w:sz w:val="20"/>
-                <w:szCs w:val="20"/>
-              </w:rPr>
-              <w:t xml:space="preserve">Indicate </w:t>
-            </w:r>
-            <w:r>
-              <w:rPr>
-                <w:rFonts w:ascii="Arial Narrow" w:hAnsi="Arial Narrow"/>
-                <w:sz w:val="20"/>
-                <w:szCs w:val="20"/>
-              </w:rPr>
-              <w:t xml:space="preserve">below </w:t>
-            </w:r>
-            <w:r>
-              <w:rPr>
-                <w:rFonts w:ascii="Arial Narrow" w:hAnsi="Arial Narrow"/>
-                <w:sz w:val="20"/>
-                <w:szCs w:val="20"/>
-              </w:rPr>
-              <w:t>how the applica</w:t>
-            </w:r>
-            <w:r>
-              <w:rPr>
-                <w:rFonts w:ascii="Arial Narrow" w:hAnsi="Arial Narrow"/>
-                <w:sz w:val="20"/>
-                <w:szCs w:val="20"/>
-              </w:rPr>
-              <w:t>n</w:t>
-            </w:r>
-            <w:r>
-              <w:rPr>
-                <w:rFonts w:ascii="Arial Narrow" w:hAnsi="Arial Narrow"/>
-                <w:sz w:val="20"/>
-                <w:szCs w:val="20"/>
-              </w:rPr>
-              <w:t>t</w:t>
-            </w:r>
-            <w:r>
-              <w:rPr>
-                <w:rFonts w:ascii="Arial Narrow" w:hAnsi="Arial Narrow"/>
-                <w:sz w:val="20"/>
-                <w:szCs w:val="20"/>
-              </w:rPr>
-              <w:t xml:space="preserve"> intends to implement the proposed activities (where applicable, indicate </w:t>
-            </w:r>
-            <w:r>
-              <w:rPr>
-                <w:rFonts w:ascii="Arial Narrow" w:hAnsi="Arial Narrow"/>
-                <w:sz w:val="20"/>
-                <w:szCs w:val="20"/>
-              </w:rPr>
-              <w:t xml:space="preserve">the </w:t>
-            </w:r>
-            <w:r>
-              <w:rPr>
-                <w:rFonts w:ascii="Arial Narrow" w:hAnsi="Arial Narrow"/>
-                <w:sz w:val="20"/>
-                <w:szCs w:val="20"/>
-              </w:rPr>
-              <w:t>involvement of thi</w:t>
-            </w:r>
-            <w:r>
-              <w:rPr>
-                <w:rFonts w:ascii="Arial Narrow" w:hAnsi="Arial Narrow"/>
-                <w:sz w:val="20"/>
-                <w:szCs w:val="20"/>
-              </w:rPr>
-              <w:t>rd parties including providers) ▼</w:t>
+              <w:t>Укажите ниже, как заявитель намерен реализовать предлагаемые мероприятия (где применимо, укажите участие третьих сторон, включая поставщиков) ▼</w:t>
             </w:r>
           </w:p>
         </w:tc>
@@ -3278,7 +2939,40 @@
               </w:rPr>
             </w:pPr>
             <w:r>
-              <w:t>10. Grantee/Consortium’s Финансовый потенциал</w:t>
+              <w:rPr>
+                <w:rFonts w:ascii="Arial Narrow" w:hAnsi="Arial Narrow"/>
+                <w:b/>
+                <w:sz w:val="20"/>
+                <w:szCs w:val="20"/>
+              </w:rPr>
+              <w:t>10</w:t>
+            </w:r>
+            <w:r>
+              <w:rPr>
+                <w:rFonts w:ascii="Arial Narrow" w:hAnsi="Arial Narrow"/>
+                <w:b/>
+                <w:sz w:val="20"/>
+                <w:szCs w:val="20"/>
+              </w:rPr>
+              <w:t xml:space="preserve">. </w:t>
+            </w:r>
+            <w:r>
+              <w:rPr>
+                <w:rFonts w:ascii="Arial Narrow" w:hAnsi="Arial Narrow"/>
+                <w:b/>
+                <w:sz w:val="20"/>
+                <w:szCs w:val="20"/>
+              </w:rPr>
+              <w:t>Grantee/Consortium</w:t>
+            </w:r>
+            <w:r>
+              <w:rPr>
+                <w:rFonts w:ascii="Arial Narrow" w:hAnsi="Arial Narrow"/>
+                <w:b/>
+                <w:sz w:val="20"/>
+                <w:szCs w:val="20"/>
+              </w:rPr>
+              <w:t>’s financial capacity</w:t>
             </w:r>
           </w:p>
         </w:tc>
@@ -3306,7 +3000,7 @@
               </w:rPr>
             </w:pPr>
             <w:r>
-              <w:t>Indicate below any information reflecting the applicant’s Финансовый потенциал, such as turnover or equivalent (annual budget) for the last 2 (two) years, net earnings (if any), total balance sheet or budget, or medium and long-term debt (if any) ▼</w:t>
+              <w:t>Укажите ниже any information reflecting the applicant’s financial capacity, such as turnover or equivalent (annual budget) for the last 2 (two) years, net earnings (if any), total balance sheet or budget, or medium and long-term debt (if any) ▼</w:t>
             </w:r>
           </w:p>
         </w:tc>
@@ -3418,81 +3112,7 @@
               </w:rPr>
             </w:pPr>
             <w:r>
-              <w:rPr>
-                <w:rFonts w:ascii="Arial Narrow" w:hAnsi="Arial Narrow"/>
-                <w:b/>
-                <w:sz w:val="20"/>
-                <w:szCs w:val="20"/>
-              </w:rPr>
-              <w:t>Co-funding</w:t>
-            </w:r>
-            <w:r>
-              <w:rPr>
-                <w:rFonts w:ascii="Arial Narrow" w:hAnsi="Arial Narrow"/>
-                <w:b/>
-                <w:sz w:val="20"/>
-                <w:szCs w:val="20"/>
-              </w:rPr>
-              <w:t xml:space="preserve">: </w:t>
-            </w:r>
-            <w:r>
-              <w:rPr>
-                <w:rFonts w:ascii="Arial Narrow" w:hAnsi="Arial Narrow"/>
-                <w:sz w:val="20"/>
-                <w:szCs w:val="20"/>
-              </w:rPr>
-              <w:t xml:space="preserve">Indicate </w:t>
-            </w:r>
-            <w:r>
-              <w:rPr>
-                <w:rFonts w:ascii="Arial Narrow" w:hAnsi="Arial Narrow"/>
-                <w:sz w:val="20"/>
-                <w:szCs w:val="20"/>
-              </w:rPr>
-              <w:t xml:space="preserve">below </w:t>
-            </w:r>
-            <w:r>
-              <w:rPr>
-                <w:rFonts w:ascii="Arial Narrow" w:hAnsi="Arial Narrow"/>
-                <w:sz w:val="20"/>
-                <w:szCs w:val="20"/>
-              </w:rPr>
-              <w:t>how</w:t>
-            </w:r>
-            <w:r>
-              <w:rPr>
-                <w:rFonts w:ascii="Arial Narrow" w:hAnsi="Arial Narrow" w:cs="Arial"/>
-                <w:sz w:val="20"/>
-                <w:szCs w:val="20"/>
-                <w:lang w:val="en-GB"/>
-              </w:rPr>
-              <w:t xml:space="preserve"> the applicant intends to contribute to the project (either by way of its own resources or by contribution from third parties). Co-financing may take the form of financial or human resources, in-kind contributions or income gene</w:t>
-            </w:r>
-            <w:r>
-              <w:rPr>
-                <w:rFonts w:ascii="Arial Narrow" w:hAnsi="Arial Narrow" w:cs="Arial"/>
-                <w:sz w:val="20"/>
-                <w:szCs w:val="20"/>
-                <w:lang w:val="en-GB"/>
-              </w:rPr>
-              <w:t>rated by the action or proje</w:t>
-            </w:r>
-            <w:r>
-              <w:rPr>
-                <w:rFonts w:ascii="Arial Narrow" w:hAnsi="Arial Narrow" w:cs="Arial"/>
-                <w:sz w:val="20"/>
-                <w:szCs w:val="20"/>
-                <w:lang w:val="en-GB"/>
-              </w:rPr>
-              <w:t>ct</w:t>
-            </w:r>
-            <w:r>
-              <w:rPr>
-                <w:rFonts w:ascii="Arial Narrow" w:hAnsi="Arial Narrow"/>
-                <w:sz w:val="20"/>
-                <w:szCs w:val="20"/>
-              </w:rPr>
-              <w:t xml:space="preserve"> ▼</w:t>
+              <w:t>Софинансирование: Укажите ниже, как заявитель намерен внести вклад в проект (либо за счет собственных ресурсов, либо за счет вклада третьих сторон). Софинансирование может принимать форму финансовых или человеческих ресурсов, взносов в натуральной форме или дохода, полученного от действия или проекта ▼</w:t>
             </w:r>
           </w:p>
         </w:tc>
@@ -3574,41 +3194,7 @@
               </w:rPr>
             </w:pPr>
             <w:r>
-              <w:rPr>
-                <w:rFonts w:ascii="Arial Narrow" w:hAnsi="Arial Narrow"/>
-                <w:b/>
-                <w:bCs/>
-                <w:sz w:val="20"/>
-                <w:szCs w:val="20"/>
-                <w:lang w:val="en-GB"/>
-              </w:rPr>
-              <w:t xml:space="preserve">Other sources of funding: </w:t>
-            </w:r>
-            <w:r>
-              <w:rPr>
-                <w:rFonts w:ascii="Arial Narrow" w:hAnsi="Arial Narrow"/>
-                <w:sz w:val="20"/>
-                <w:szCs w:val="20"/>
-                <w:lang w:val="en-GB"/>
-              </w:rPr>
-              <w:t>Indicate below whether the applicant has received other funding for the same project or action. If so, please specify which part(s) of the project or action are funded by these other sources of funding. Please note that the grant awarded by the Council of Europe cannot be used to finance part of an action or project already financed in whole or in part by other means</w:t>
-            </w:r>
-            <w:r>
-              <w:rPr>
-                <w:rFonts w:ascii="Arial Narrow" w:hAnsi="Arial Narrow"/>
-                <w:sz w:val="20"/>
-                <w:szCs w:val="20"/>
-                <w:lang w:val="en-GB"/>
-              </w:rPr>
-              <w:t xml:space="preserve"> </w:t>
-            </w:r>
-            <w:r>
-              <w:rPr>
-                <w:rFonts w:ascii="Arial Narrow" w:hAnsi="Arial Narrow"/>
-                <w:sz w:val="20"/>
-                <w:szCs w:val="20"/>
-              </w:rPr>
-              <w:t>▼</w:t>
+              <w:t>Другие источники финансирования: Укажите ниже, получал ли заявитель другое финансирование для того же проекта или действия. Если да, пожалуйста, укажите, какая(ие) часть(и) проекта или действия финансируются из этих других источников финансирования. Обратите внимание, что грант, присужденный Советом Европы, не может быть использован для финансирования части действия или проекта, уже финансируемого полностью или частично другими средствами ▼</w:t>
             </w:r>
           </w:p>
         </w:tc>
@@ -3713,106 +3299,7 @@
               </w:rPr>
             </w:pPr>
             <w:r>
-              <w:rPr>
-                <w:rFonts w:ascii="Arial Narrow" w:hAnsi="Arial Narrow"/>
-                <w:sz w:val="20"/>
-                <w:szCs w:val="20"/>
-              </w:rPr>
-              <w:t xml:space="preserve">By signing this </w:t>
-            </w:r>
-            <w:proofErr w:type="gramStart"/>
-            <w:r>
-              <w:rPr>
-                <w:rFonts w:ascii="Arial Narrow" w:hAnsi="Arial Narrow"/>
-                <w:sz w:val="20"/>
-                <w:szCs w:val="20"/>
-              </w:rPr>
-              <w:t xml:space="preserve">form  </w:t>
-            </w:r>
-            <w:r>
-              <w:rPr>
-                <w:rFonts w:ascii="Arial Narrow" w:hAnsi="Arial Narrow"/>
-                <w:sz w:val="20"/>
-                <w:szCs w:val="20"/>
-              </w:rPr>
-              <w:t>I</w:t>
-            </w:r>
-            <w:proofErr w:type="gramEnd"/>
-            <w:r>
-              <w:rPr>
-                <w:rFonts w:ascii="Arial Narrow" w:hAnsi="Arial Narrow"/>
-                <w:sz w:val="20"/>
-                <w:szCs w:val="20"/>
-              </w:rPr>
-              <w:t xml:space="preserve">, the undersigned, </w:t>
-            </w:r>
-            <w:proofErr w:type="spellStart"/>
-            <w:r>
-              <w:rPr>
-                <w:rFonts w:ascii="Arial Narrow" w:hAnsi="Arial Narrow"/>
-                <w:sz w:val="20"/>
-                <w:szCs w:val="20"/>
-              </w:rPr>
-              <w:t>authori</w:t>
-            </w:r>
-            <w:r>
-              <w:rPr>
-                <w:rFonts w:ascii="Arial Narrow" w:hAnsi="Arial Narrow"/>
-                <w:sz w:val="20"/>
-                <w:szCs w:val="20"/>
-              </w:rPr>
-              <w:t>s</w:t>
-            </w:r>
-            <w:r>
-              <w:rPr>
-                <w:rFonts w:ascii="Arial Narrow" w:hAnsi="Arial Narrow"/>
-                <w:sz w:val="20"/>
-                <w:szCs w:val="20"/>
-              </w:rPr>
-              <w:t>ed</w:t>
-            </w:r>
-            <w:proofErr w:type="spellEnd"/>
-            <w:r>
-              <w:rPr>
-                <w:rFonts w:ascii="Arial Narrow" w:hAnsi="Arial Narrow"/>
-                <w:sz w:val="20"/>
-                <w:szCs w:val="20"/>
-              </w:rPr>
-              <w:t xml:space="preserve"> to represent the </w:t>
-            </w:r>
-            <w:r>
-              <w:rPr>
-                <w:rFonts w:ascii="Arial Narrow" w:hAnsi="Arial Narrow"/>
-                <w:sz w:val="20"/>
-                <w:szCs w:val="20"/>
-              </w:rPr>
-              <w:t>Grantee/Consortium</w:t>
-            </w:r>
-            <w:r>
-              <w:rPr>
-                <w:rFonts w:ascii="Arial Narrow" w:hAnsi="Arial Narrow"/>
-                <w:sz w:val="20"/>
-                <w:szCs w:val="20"/>
-              </w:rPr>
-              <w:t xml:space="preserve">, hereby certify that the information contained in this application is correct and that the applicant </w:t>
-            </w:r>
-            <w:proofErr w:type="spellStart"/>
-            <w:r>
-              <w:rPr>
-                <w:rFonts w:ascii="Arial Narrow" w:hAnsi="Arial Narrow"/>
-                <w:sz w:val="20"/>
-                <w:szCs w:val="20"/>
-              </w:rPr>
-              <w:t>organisation</w:t>
-            </w:r>
-            <w:proofErr w:type="spellEnd"/>
-            <w:r>
-              <w:rPr>
-                <w:rFonts w:ascii="Arial Narrow" w:hAnsi="Arial Narrow"/>
-                <w:sz w:val="20"/>
-                <w:szCs w:val="20"/>
-              </w:rPr>
-              <w:t xml:space="preserve"> has not received or applied for any other Council of Europe funding to carry out the action which is the subject of this grant application.</w:t>
+              <w:t>Подписывая эту форму, я, нижеподписавшийся, уполномоченный представлять грантополучателя/консорциум, настоящим удостоверяю, что информация, содержащаяся в этой заявке, является правильной и что организация-заявитель не получала и не подавала заявку на какое-либо другое финансирование Совета Европы для выполнения действия, которое является предметом этой заявки на грант.</w:t>
             </w:r>
           </w:p>
           <w:p>
@@ -4500,48 +3987,7 @@
               </w:rPr>
             </w:pPr>
             <w:r>
-              <w:rPr>
-                <w:rFonts w:ascii="Arial Narrow" w:hAnsi="Arial Narrow"/>
-                <w:sz w:val="20"/>
-                <w:szCs w:val="20"/>
-              </w:rPr>
-              <w:t xml:space="preserve">The Council of Europe publishes annually information about awarded grants on its website (available at </w:t>
-            </w:r>
-            <w:hyperlink r:id="rId12" w:history="1">
-              <w:r>
-                <w:rPr>
-                  <w:rStyle w:val="ac"/>
-                  <w:rFonts w:ascii="Arial Narrow" w:hAnsi="Arial Narrow"/>
-                  <w:sz w:val="20"/>
-                  <w:szCs w:val="20"/>
-                </w:rPr>
-                <w:t>https://www.coe.int/en/web/portal/grants</w:t>
-              </w:r>
-            </w:hyperlink>
-            <w:r>
-              <w:rPr>
-                <w:rFonts w:ascii="Arial Narrow" w:hAnsi="Arial Narrow"/>
-                <w:sz w:val="20"/>
-                <w:szCs w:val="20"/>
-              </w:rPr>
-              <w:t>) pursuant to Article 2.1.4 of Rule No. 1374 of 16 December 2015 on the grant award procedures of the Council of Europe. Please indicate below whether</w:t>
-            </w:r>
-            <w:r>
-              <w:rPr>
-                <w:rFonts w:ascii="Arial Narrow" w:hAnsi="Arial Narrow" w:cs="Arial"/>
-                <w:sz w:val="20"/>
-                <w:szCs w:val="20"/>
-                <w:lang w:val="en-GB"/>
-              </w:rPr>
-              <w:t xml:space="preserve"> the applicant has any objections to the publication of information on the award decision (the title of the Agreement, the nature and purpose of the Agreement, name and locality of the Grantee and amount of the Agreement) should its application be successful and, if so, the reasons for such objection</w:t>
-            </w:r>
-            <w:r>
-              <w:rPr>
-                <w:rFonts w:ascii="Arial Narrow" w:hAnsi="Arial Narrow"/>
-                <w:sz w:val="20"/>
-                <w:szCs w:val="20"/>
-              </w:rPr>
-              <w:t xml:space="preserve"> ▼</w:t>
+              <w:t>The Council of Europe publishes annually information about awarded grants on its website (available at https://www.coe.int/en/web/portal/grants) pursuant to Article 2.1.4 of Rule No. 1374 of 16 December 2015 on the grant award procedures of the Council of Europe. Пожалуйста, укажите below whether the applicant has any objections to the publication of information on the award decision (the title of the Agreement, the nature and purpose of the Agreement, name and locality of the Grantee and amount of the Agreement) should its application be successful and, if so, the reasons for such objection ▼</w:t>
             </w:r>
           </w:p>
         </w:tc>
@@ -4680,22 +4126,16 @@
               </w:rPr>
             </w:pPr>
             <w:r>
+              <w:t>Заполните таблицу ниже и подпишите в последнем поле</w:t>
+            </w:r>
+          </w:p>
+          <w:p>
+            <w:pPr>
               <w:rPr>
                 <w:rFonts w:ascii="Arial Narrow" w:eastAsia="Calibri" w:hAnsi="Arial Narrow"/>
                 <w:bCs/>
                 <w:sz w:val="20"/>
                 <w:szCs w:val="20"/>
-              </w:rPr>
-              <w:t>Complete the table below and sign in the last box</w:t>
-            </w:r>
-          </w:p>
-          <w:p>
-            <w:pPr>
-              <w:rPr>
-                <w:rFonts w:ascii="Arial Narrow" w:eastAsia="Calibri" w:hAnsi="Arial Narrow"/>
-                <w:bCs/>
-                <w:sz w:val="20"/>
-                <w:szCs w:val="20"/>
                 <w:lang w:val="en-GB"/>
               </w:rPr>
             </w:pPr>
@@ -4712,26 +4152,7 @@
               </w:rPr>
             </w:pPr>
             <w:r>
-              <w:rPr>
-                <w:rFonts w:ascii="Arial Narrow" w:eastAsia="Calibri" w:hAnsi="Arial Narrow"/>
-                <w:b/>
-                <w:sz w:val="20"/>
-                <w:szCs w:val="20"/>
-                <w:u w:val="single"/>
-                <w:lang w:val="en-GB"/>
-              </w:rPr>
-              <w:t>GRANTEE</w:t>
-            </w:r>
-            <w:r>
-              <w:rPr>
-                <w:rFonts w:ascii="Arial Narrow" w:eastAsia="Calibri" w:hAnsi="Arial Narrow"/>
-                <w:b/>
-                <w:sz w:val="20"/>
-                <w:szCs w:val="20"/>
-                <w:u w:val="single"/>
-                <w:lang w:val="en-GB"/>
-              </w:rPr>
-              <w:t>:</w:t>
+              <w:t>ГРАНТОПОЛУЧАТЕЛЬ:</w:t>
             </w:r>
           </w:p>
         </w:tc>
@@ -4821,14 +4242,7 @@
               </w:rPr>
             </w:pPr>
             <w:r>
-              <w:rPr>
-                <w:rFonts w:ascii="Arial Narrow" w:eastAsia="Calibri" w:hAnsi="Arial Narrow"/>
-                <w:bCs/>
-                <w:sz w:val="20"/>
-                <w:szCs w:val="20"/>
-                <w:lang w:val="en-GB"/>
-              </w:rPr>
-              <w:t>Title or position of the Signatory in the applicant organisation ►</w:t>
+              <w:t>Должность или позиция подписанта в организации-заявителе ►</w:t>
             </w:r>
           </w:p>
         </w:tc>
@@ -4914,15 +4328,7 @@
               </w:rPr>
             </w:pPr>
             <w:r>
-              <w:rPr>
-                <w:rFonts w:ascii="Arial Narrow" w:eastAsia="Calibri" w:hAnsi="Arial Narrow"/>
-                <w:b/>
-                <w:bCs/>
-                <w:sz w:val="20"/>
-                <w:szCs w:val="20"/>
-                <w:lang w:val="en-GB"/>
-              </w:rPr>
-              <w:t>Done in:</w:t>
+              <w:t>Составлено в:</w:t>
             </w:r>
           </w:p>
         </w:tc>
@@ -4979,15 +4385,7 @@
               </w:rPr>
             </w:pPr>
             <w:r>
-              <w:rPr>
-                <w:rFonts w:ascii="Arial Narrow" w:eastAsia="Calibri" w:hAnsi="Arial Narrow"/>
-                <w:b/>
-                <w:bCs/>
-                <w:sz w:val="20"/>
-                <w:szCs w:val="20"/>
-                <w:lang w:val="en-GB"/>
-              </w:rPr>
-              <w:t>On:</w:t>
+              <w:t>Дата:</w:t>
             </w:r>
           </w:p>
         </w:tc>

</xml_diff>